<commit_message>
Format inline mathematical indices as native Word subscripts
</commit_message>
<xml_diff>
--- a/design/patent-timeout-feedback-review-20261027/revised-manuscript.docx
+++ b/design/patent-timeout-feedback-review-20261027/revised-manuscript.docx
@@ -912,7 +912,7 @@
           <w:b w:val="0"/>
           <w:i w:val="0"/>
         </w:rPr>
-        <w:t>P_i</w:t>
+        <w:t>P</w:t>
       </w:r>
       <w:r>
         <w:rPr>
@@ -922,6 +922,18 @@
           <w:color w:val="000000"/>
           <w:b w:val="0"/>
           <w:i w:val="0"/>
+          <w:vertAlign w:val="subscript"/>
+        </w:rPr>
+        <w:t>i</w:t>
+      </w:r>
+      <w:r>
+        <w:rPr>
+          <w:rFonts w:ascii="宋体" w:hAnsi="宋体" w:eastAsia="宋体" w:cs="宋体"/>
+          <w:sz w:val="24"/>
+          <w:szCs w:val="24"/>
+          <w:color w:val="000000"/>
+          <w:b w:val="0"/>
+          <w:i w:val="0"/>
         </w:rPr>
         <w:t>。限时执行单元为该轮设置期限</w:t>
       </w:r>
@@ -934,7 +946,19 @@
           <w:b w:val="0"/>
           <w:i w:val="0"/>
         </w:rPr>
-        <w:t>T_i</w:t>
+        <w:t>T</w:t>
+      </w:r>
+      <w:r>
+        <w:rPr>
+          <w:rFonts w:ascii="宋体" w:hAnsi="宋体" w:eastAsia="宋体" w:cs="宋体"/>
+          <w:sz w:val="24"/>
+          <w:szCs w:val="24"/>
+          <w:color w:val="000000"/>
+          <w:b w:val="0"/>
+          <w:i w:val="0"/>
+          <w:vertAlign w:val="subscript"/>
+        </w:rPr>
+        <w:t>i</w:t>
       </w:r>
       <w:r>
         <w:rPr>
@@ -1106,7 +1130,7 @@
           <w:b w:val="0"/>
           <w:i w:val="0"/>
         </w:rPr>
-        <w:t>P_i</w:t>
+        <w:t>P</w:t>
       </w:r>
       <w:r>
         <w:rPr>
@@ -1116,6 +1140,18 @@
           <w:color w:val="000000"/>
           <w:b w:val="0"/>
           <w:i w:val="0"/>
+          <w:vertAlign w:val="subscript"/>
+        </w:rPr>
+        <w:t>i</w:t>
+      </w:r>
+      <w:r>
+        <w:rPr>
+          <w:rFonts w:ascii="宋体" w:hAnsi="宋体" w:eastAsia="宋体" w:cs="宋体"/>
+          <w:sz w:val="24"/>
+          <w:szCs w:val="24"/>
+          <w:color w:val="000000"/>
+          <w:b w:val="0"/>
+          <w:i w:val="0"/>
         </w:rPr>
         <w:t>，该轮的实际执行期限为</w:t>
       </w:r>
@@ -1128,7 +1164,19 @@
           <w:b w:val="0"/>
           <w:i w:val="0"/>
         </w:rPr>
-        <w:t>T_i</w:t>
+        <w:t>T</w:t>
+      </w:r>
+      <w:r>
+        <w:rPr>
+          <w:rFonts w:ascii="宋体" w:hAnsi="宋体" w:eastAsia="宋体" w:cs="宋体"/>
+          <w:sz w:val="24"/>
+          <w:szCs w:val="24"/>
+          <w:color w:val="000000"/>
+          <w:b w:val="0"/>
+          <w:i w:val="0"/>
+          <w:vertAlign w:val="subscript"/>
+        </w:rPr>
+        <w:t>i</w:t>
       </w:r>
       <w:r>
         <w:rPr>
@@ -1214,7 +1262,7 @@
           <w:b w:val="0"/>
           <w:i w:val="0"/>
         </w:rPr>
-        <w:t>T₀</w:t>
+        <w:t>T</w:t>
       </w:r>
       <w:r>
         <w:rPr>
@@ -1224,6 +1272,18 @@
           <w:color w:val="000000"/>
           <w:b w:val="0"/>
           <w:i w:val="0"/>
+          <w:vertAlign w:val="subscript"/>
+        </w:rPr>
+        <w:t>0</w:t>
+      </w:r>
+      <w:r>
+        <w:rPr>
+          <w:rFonts w:ascii="宋体" w:hAnsi="宋体" w:eastAsia="宋体" w:cs="宋体"/>
+          <w:sz w:val="24"/>
+          <w:szCs w:val="24"/>
+          <w:color w:val="000000"/>
+          <w:b w:val="0"/>
+          <w:i w:val="0"/>
         </w:rPr>
         <w:t>。尚未在反馈迭代中取得正常完成并保留的候选计划时，使用</w:t>
       </w:r>
@@ -1236,7 +1296,7 @@
           <w:b w:val="0"/>
           <w:i w:val="0"/>
         </w:rPr>
-        <w:t>T₀</w:t>
+        <w:t>T</w:t>
       </w:r>
       <w:r>
         <w:rPr>
@@ -1246,6 +1306,18 @@
           <w:color w:val="000000"/>
           <w:b w:val="0"/>
           <w:i w:val="0"/>
+          <w:vertAlign w:val="subscript"/>
+        </w:rPr>
+        <w:t>0</w:t>
+      </w:r>
+      <w:r>
+        <w:rPr>
+          <w:rFonts w:ascii="宋体" w:hAnsi="宋体" w:eastAsia="宋体" w:cs="宋体"/>
+          <w:sz w:val="24"/>
+          <w:szCs w:val="24"/>
+          <w:color w:val="000000"/>
+          <w:b w:val="0"/>
+          <w:i w:val="0"/>
         </w:rPr>
         <w:t>；取得这些候选中的最佳完整运行时间</w:t>
       </w:r>
@@ -1258,7 +1330,19 @@
           <w:b w:val="0"/>
           <w:i w:val="0"/>
         </w:rPr>
-        <w:t>t_best</w:t>
+        <w:t>t</w:t>
+      </w:r>
+      <w:r>
+        <w:rPr>
+          <w:rFonts w:ascii="宋体" w:hAnsi="宋体" w:eastAsia="宋体" w:cs="宋体"/>
+          <w:sz w:val="24"/>
+          <w:szCs w:val="24"/>
+          <w:color w:val="000000"/>
+          <w:b w:val="0"/>
+          <w:i w:val="0"/>
+          <w:vertAlign w:val="subscript"/>
+        </w:rPr>
+        <w:t>best</w:t>
       </w:r>
       <w:r>
         <w:rPr>
@@ -1459,7 +1543,7 @@
           <w:b w:val="0"/>
           <w:i w:val="0"/>
         </w:rPr>
-        <w:t>T₀=10秒</w:t>
+        <w:t>T</w:t>
       </w:r>
       <w:r>
         <w:rPr>
@@ -1469,6 +1553,29 @@
           <w:color w:val="000000"/>
           <w:b w:val="0"/>
           <w:i w:val="0"/>
+          <w:vertAlign w:val="subscript"/>
+        </w:rPr>
+        <w:t>0</w:t>
+      </w:r>
+      <w:r>
+        <w:rPr>
+          <w:rFonts w:ascii="宋体" w:hAnsi="宋体" w:eastAsia="宋体" w:cs="宋体"/>
+          <w:sz w:val="24"/>
+          <w:szCs w:val="24"/>
+          <w:color w:val="000000"/>
+          <w:b w:val="0"/>
+          <w:i w:val="0"/>
+        </w:rPr>
+        <w:t>=10秒</w:t>
+      </w:r>
+      <w:r>
+        <w:rPr>
+          <w:rFonts w:ascii="宋体" w:hAnsi="宋体" w:eastAsia="宋体" w:cs="宋体"/>
+          <w:sz w:val="24"/>
+          <w:szCs w:val="24"/>
+          <w:color w:val="000000"/>
+          <w:b w:val="0"/>
+          <w:i w:val="0"/>
         </w:rPr>
         <w:t>；如果最佳完整运行时间为4秒，则后续执行上限为5秒。取消时已耗的时间不作为完整运行时间，也不用于更新</w:t>
       </w:r>
@@ -1481,7 +1588,19 @@
           <w:b w:val="0"/>
           <w:i w:val="0"/>
         </w:rPr>
-        <w:t>t_best</w:t>
+        <w:t>t</w:t>
+      </w:r>
+      <w:r>
+        <w:rPr>
+          <w:rFonts w:ascii="宋体" w:hAnsi="宋体" w:eastAsia="宋体" w:cs="宋体"/>
+          <w:sz w:val="24"/>
+          <w:szCs w:val="24"/>
+          <w:color w:val="000000"/>
+          <w:b w:val="0"/>
+          <w:i w:val="0"/>
+          <w:vertAlign w:val="subscript"/>
+        </w:rPr>
+        <w:t>best</w:t>
       </w:r>
       <w:r>
         <w:rPr>
@@ -2198,7 +2317,7 @@
           <w:b w:val="0"/>
           <w:i w:val="0"/>
         </w:rPr>
-        <w:t>E_i(k)</w:t>
+        <w:t>E</w:t>
       </w:r>
       <w:r>
         <w:rPr>
@@ -2208,6 +2327,29 @@
           <w:color w:val="000000"/>
           <w:b w:val="0"/>
           <w:i w:val="0"/>
+          <w:vertAlign w:val="subscript"/>
+        </w:rPr>
+        <w:t>i</w:t>
+      </w:r>
+      <w:r>
+        <w:rPr>
+          <w:rFonts w:ascii="宋体" w:hAnsi="宋体" w:eastAsia="宋体" w:cs="宋体"/>
+          <w:sz w:val="24"/>
+          <w:szCs w:val="24"/>
+          <w:color w:val="000000"/>
+          <w:b w:val="0"/>
+          <w:i w:val="0"/>
+        </w:rPr>
+        <w:t>(k)</w:t>
+      </w:r>
+      <w:r>
+        <w:rPr>
+          <w:rFonts w:ascii="宋体" w:hAnsi="宋体" w:eastAsia="宋体" w:cs="宋体"/>
+          <w:sz w:val="24"/>
+          <w:szCs w:val="24"/>
+          <w:color w:val="000000"/>
+          <w:b w:val="0"/>
+          <w:i w:val="0"/>
         </w:rPr>
         <w:t>，截至采集时点</w:t>
       </w:r>
@@ -2220,7 +2362,7 @@
           <w:b w:val="0"/>
           <w:i w:val="0"/>
         </w:rPr>
-        <w:t>t_i</w:t>
+        <w:t>t</w:t>
       </w:r>
       <w:r>
         <w:rPr>
@@ -2230,6 +2372,18 @@
           <w:color w:val="000000"/>
           <w:b w:val="0"/>
           <w:i w:val="0"/>
+          <w:vertAlign w:val="subscript"/>
+        </w:rPr>
+        <w:t>i</w:t>
+      </w:r>
+      <w:r>
+        <w:rPr>
+          <w:rFonts w:ascii="宋体" w:hAnsi="宋体" w:eastAsia="宋体" w:cs="宋体"/>
+          <w:sz w:val="24"/>
+          <w:szCs w:val="24"/>
+          <w:color w:val="000000"/>
+          <w:b w:val="0"/>
+          <w:i w:val="0"/>
         </w:rPr>
         <w:t>的已返回行数记为</w:t>
       </w:r>
@@ -2242,7 +2396,7 @@
           <w:b w:val="0"/>
           <w:i w:val="0"/>
         </w:rPr>
-        <w:t>A_i(k,t_i)</w:t>
+        <w:t>A</w:t>
       </w:r>
       <w:r>
         <w:rPr>
@@ -2252,6 +2406,63 @@
           <w:color w:val="000000"/>
           <w:b w:val="0"/>
           <w:i w:val="0"/>
+          <w:vertAlign w:val="subscript"/>
+        </w:rPr>
+        <w:t>i</w:t>
+      </w:r>
+      <w:r>
+        <w:rPr>
+          <w:rFonts w:ascii="宋体" w:hAnsi="宋体" w:eastAsia="宋体" w:cs="宋体"/>
+          <w:sz w:val="24"/>
+          <w:szCs w:val="24"/>
+          <w:color w:val="000000"/>
+          <w:b w:val="0"/>
+          <w:i w:val="0"/>
+        </w:rPr>
+        <w:t>(k,</w:t>
+      </w:r>
+      <w:r>
+        <w:rPr>
+          <w:rFonts w:ascii="宋体" w:hAnsi="宋体" w:eastAsia="宋体" w:cs="宋体"/>
+          <w:sz w:val="24"/>
+          <w:szCs w:val="24"/>
+          <w:color w:val="000000"/>
+          <w:b w:val="0"/>
+          <w:i w:val="0"/>
+        </w:rPr>
+        <w:t>t</w:t>
+      </w:r>
+      <w:r>
+        <w:rPr>
+          <w:rFonts w:ascii="宋体" w:hAnsi="宋体" w:eastAsia="宋体" w:cs="宋体"/>
+          <w:sz w:val="24"/>
+          <w:szCs w:val="24"/>
+          <w:color w:val="000000"/>
+          <w:b w:val="0"/>
+          <w:i w:val="0"/>
+          <w:vertAlign w:val="subscript"/>
+        </w:rPr>
+        <w:t>i</w:t>
+      </w:r>
+      <w:r>
+        <w:rPr>
+          <w:rFonts w:ascii="宋体" w:hAnsi="宋体" w:eastAsia="宋体" w:cs="宋体"/>
+          <w:sz w:val="24"/>
+          <w:szCs w:val="24"/>
+          <w:color w:val="000000"/>
+          <w:b w:val="0"/>
+          <w:i w:val="0"/>
+        </w:rPr>
+        <w:t>)</w:t>
+      </w:r>
+      <w:r>
+        <w:rPr>
+          <w:rFonts w:ascii="宋体" w:hAnsi="宋体" w:eastAsia="宋体" w:cs="宋体"/>
+          <w:sz w:val="24"/>
+          <w:szCs w:val="24"/>
+          <w:color w:val="000000"/>
+          <w:b w:val="0"/>
+          <w:i w:val="0"/>
         </w:rPr>
         <w:t>。如果计划继续执行到该目标在限定范围内的全部调用结束，最终返回行数记为</w:t>
       </w:r>
@@ -2264,7 +2475,30 @@
           <w:b w:val="0"/>
           <w:i w:val="0"/>
         </w:rPr>
-        <w:t>C_i(k)</w:t>
+        <w:t>C</w:t>
+      </w:r>
+      <w:r>
+        <w:rPr>
+          <w:rFonts w:ascii="宋体" w:hAnsi="宋体" w:eastAsia="宋体" w:cs="宋体"/>
+          <w:sz w:val="24"/>
+          <w:szCs w:val="24"/>
+          <w:color w:val="000000"/>
+          <w:b w:val="0"/>
+          <w:i w:val="0"/>
+          <w:vertAlign w:val="subscript"/>
+        </w:rPr>
+        <w:t>i</w:t>
+      </w:r>
+      <w:r>
+        <w:rPr>
+          <w:rFonts w:ascii="宋体" w:hAnsi="宋体" w:eastAsia="宋体" w:cs="宋体"/>
+          <w:sz w:val="24"/>
+          <w:szCs w:val="24"/>
+          <w:color w:val="000000"/>
+          <w:b w:val="0"/>
+          <w:i w:val="0"/>
+        </w:rPr>
+        <w:t>(k)</w:t>
       </w:r>
       <w:r>
         <w:rPr>
@@ -2456,7 +2690,7 @@
           <w:b w:val="0"/>
           <w:i w:val="0"/>
         </w:rPr>
-        <w:t>B_i(k)</w:t>
+        <w:t>B</w:t>
       </w:r>
       <w:r>
         <w:rPr>
@@ -2466,6 +2700,29 @@
           <w:color w:val="000000"/>
           <w:b w:val="0"/>
           <w:i w:val="0"/>
+          <w:vertAlign w:val="subscript"/>
+        </w:rPr>
+        <w:t>i</w:t>
+      </w:r>
+      <w:r>
+        <w:rPr>
+          <w:rFonts w:ascii="宋体" w:hAnsi="宋体" w:eastAsia="宋体" w:cs="宋体"/>
+          <w:sz w:val="24"/>
+          <w:szCs w:val="24"/>
+          <w:color w:val="000000"/>
+          <w:b w:val="0"/>
+          <w:i w:val="0"/>
+        </w:rPr>
+        <w:t>(k)</w:t>
+      </w:r>
+      <w:r>
+        <w:rPr>
+          <w:rFonts w:ascii="宋体" w:hAnsi="宋体" w:eastAsia="宋体" w:cs="宋体"/>
+          <w:sz w:val="24"/>
+          <w:szCs w:val="24"/>
+          <w:color w:val="000000"/>
+          <w:b w:val="0"/>
+          <w:i w:val="0"/>
         </w:rPr>
         <w:t>。本轮计划的估算行数记为</w:t>
       </w:r>
@@ -2478,7 +2735,7 @@
           <w:b w:val="0"/>
           <w:i w:val="0"/>
         </w:rPr>
-        <w:t>E_i(k)</w:t>
+        <w:t>E</w:t>
       </w:r>
       <w:r>
         <w:rPr>
@@ -2488,6 +2745,29 @@
           <w:color w:val="000000"/>
           <w:b w:val="0"/>
           <w:i w:val="0"/>
+          <w:vertAlign w:val="subscript"/>
+        </w:rPr>
+        <w:t>i</w:t>
+      </w:r>
+      <w:r>
+        <w:rPr>
+          <w:rFonts w:ascii="宋体" w:hAnsi="宋体" w:eastAsia="宋体" w:cs="宋体"/>
+          <w:sz w:val="24"/>
+          <w:szCs w:val="24"/>
+          <w:color w:val="000000"/>
+          <w:b w:val="0"/>
+          <w:i w:val="0"/>
+        </w:rPr>
+        <w:t>(k)</w:t>
+      </w:r>
+      <w:r>
+        <w:rPr>
+          <w:rFonts w:ascii="宋体" w:hAnsi="宋体" w:eastAsia="宋体" w:cs="宋体"/>
+          <w:sz w:val="24"/>
+          <w:szCs w:val="24"/>
+          <w:color w:val="000000"/>
+          <w:b w:val="0"/>
+          <w:i w:val="0"/>
         </w:rPr>
         <w:t>，采集时已返回行数记为</w:t>
       </w:r>
@@ -2500,7 +2780,19 @@
           <w:b w:val="0"/>
           <w:i w:val="0"/>
         </w:rPr>
-        <w:t>A_i</w:t>
+        <w:t>A</w:t>
+      </w:r>
+      <w:r>
+        <w:rPr>
+          <w:rFonts w:ascii="宋体" w:hAnsi="宋体" w:eastAsia="宋体" w:cs="宋体"/>
+          <w:sz w:val="24"/>
+          <w:szCs w:val="24"/>
+          <w:color w:val="000000"/>
+          <w:b w:val="0"/>
+          <w:i w:val="0"/>
+          <w:vertAlign w:val="subscript"/>
+        </w:rPr>
+        <w:t>i</w:t>
       </w:r>
       <w:r>
         <w:rPr>
@@ -2543,7 +2835,7 @@
           <w:b w:val="0"/>
           <w:i w:val="0"/>
         </w:rPr>
-        <w:t>A_i=C_i</w:t>
+        <w:t>A</w:t>
       </w:r>
       <w:r>
         <w:rPr>
@@ -2553,6 +2845,52 @@
           <w:color w:val="000000"/>
           <w:b w:val="0"/>
           <w:i w:val="0"/>
+          <w:vertAlign w:val="subscript"/>
+        </w:rPr>
+        <w:t>i</w:t>
+      </w:r>
+      <w:r>
+        <w:rPr>
+          <w:rFonts w:ascii="宋体" w:hAnsi="宋体" w:eastAsia="宋体" w:cs="宋体"/>
+          <w:sz w:val="24"/>
+          <w:szCs w:val="24"/>
+          <w:color w:val="000000"/>
+          <w:b w:val="0"/>
+          <w:i w:val="0"/>
+        </w:rPr>
+        <w:t>=</w:t>
+      </w:r>
+      <w:r>
+        <w:rPr>
+          <w:rFonts w:ascii="宋体" w:hAnsi="宋体" w:eastAsia="宋体" w:cs="宋体"/>
+          <w:sz w:val="24"/>
+          <w:szCs w:val="24"/>
+          <w:color w:val="000000"/>
+          <w:b w:val="0"/>
+          <w:i w:val="0"/>
+        </w:rPr>
+        <w:t>C</w:t>
+      </w:r>
+      <w:r>
+        <w:rPr>
+          <w:rFonts w:ascii="宋体" w:hAnsi="宋体" w:eastAsia="宋体" w:cs="宋体"/>
+          <w:sz w:val="24"/>
+          <w:szCs w:val="24"/>
+          <w:color w:val="000000"/>
+          <w:b w:val="0"/>
+          <w:i w:val="0"/>
+          <w:vertAlign w:val="subscript"/>
+        </w:rPr>
+        <w:t>i</w:t>
+      </w:r>
+      <w:r>
+        <w:rPr>
+          <w:rFonts w:ascii="宋体" w:hAnsi="宋体" w:eastAsia="宋体" w:cs="宋体"/>
+          <w:sz w:val="24"/>
+          <w:szCs w:val="24"/>
+          <w:color w:val="000000"/>
+          <w:b w:val="0"/>
+          <w:i w:val="0"/>
         </w:rPr>
         <w:t>，记录精确行数</w:t>
       </w:r>
@@ -2565,7 +2903,7 @@
           <w:b w:val="0"/>
           <w:i w:val="0"/>
         </w:rPr>
-        <w:t>EXACT(A_i)</w:t>
+        <w:t>EXACT(</w:t>
       </w:r>
       <w:r>
         <w:rPr>
@@ -2576,6 +2914,40 @@
           <w:b w:val="0"/>
           <w:i w:val="0"/>
         </w:rPr>
+        <w:t>A</w:t>
+      </w:r>
+      <w:r>
+        <w:rPr>
+          <w:rFonts w:ascii="宋体" w:hAnsi="宋体" w:eastAsia="宋体" w:cs="宋体"/>
+          <w:sz w:val="24"/>
+          <w:szCs w:val="24"/>
+          <w:color w:val="000000"/>
+          <w:b w:val="0"/>
+          <w:i w:val="0"/>
+          <w:vertAlign w:val="subscript"/>
+        </w:rPr>
+        <w:t>i</w:t>
+      </w:r>
+      <w:r>
+        <w:rPr>
+          <w:rFonts w:ascii="宋体" w:hAnsi="宋体" w:eastAsia="宋体" w:cs="宋体"/>
+          <w:sz w:val="24"/>
+          <w:szCs w:val="24"/>
+          <w:color w:val="000000"/>
+          <w:b w:val="0"/>
+          <w:i w:val="0"/>
+        </w:rPr>
+        <w:t>)</w:t>
+      </w:r>
+      <w:r>
+        <w:rPr>
+          <w:rFonts w:ascii="宋体" w:hAnsi="宋体" w:eastAsia="宋体" w:cs="宋体"/>
+          <w:sz w:val="24"/>
+          <w:szCs w:val="24"/>
+          <w:color w:val="000000"/>
+          <w:b w:val="0"/>
+          <w:i w:val="0"/>
+        </w:rPr>
         <w:t>；尚不能确认结果已全部返回，但已返回量在同一计数范围内只会累加时，</w:t>
       </w:r>
       <w:r>
@@ -2587,7 +2959,7 @@
           <w:b w:val="0"/>
           <w:i w:val="0"/>
         </w:rPr>
-        <w:t>A_i≤C_i</w:t>
+        <w:t>A</w:t>
       </w:r>
       <w:r>
         <w:rPr>
@@ -2597,6 +2969,52 @@
           <w:color w:val="000000"/>
           <w:b w:val="0"/>
           <w:i w:val="0"/>
+          <w:vertAlign w:val="subscript"/>
+        </w:rPr>
+        <w:t>i</w:t>
+      </w:r>
+      <w:r>
+        <w:rPr>
+          <w:rFonts w:ascii="宋体" w:hAnsi="宋体" w:eastAsia="宋体" w:cs="宋体"/>
+          <w:sz w:val="24"/>
+          <w:szCs w:val="24"/>
+          <w:color w:val="000000"/>
+          <w:b w:val="0"/>
+          <w:i w:val="0"/>
+        </w:rPr>
+        <w:t>≤</w:t>
+      </w:r>
+      <w:r>
+        <w:rPr>
+          <w:rFonts w:ascii="宋体" w:hAnsi="宋体" w:eastAsia="宋体" w:cs="宋体"/>
+          <w:sz w:val="24"/>
+          <w:szCs w:val="24"/>
+          <w:color w:val="000000"/>
+          <w:b w:val="0"/>
+          <w:i w:val="0"/>
+        </w:rPr>
+        <w:t>C</w:t>
+      </w:r>
+      <w:r>
+        <w:rPr>
+          <w:rFonts w:ascii="宋体" w:hAnsi="宋体" w:eastAsia="宋体" w:cs="宋体"/>
+          <w:sz w:val="24"/>
+          <w:szCs w:val="24"/>
+          <w:color w:val="000000"/>
+          <w:b w:val="0"/>
+          <w:i w:val="0"/>
+          <w:vertAlign w:val="subscript"/>
+        </w:rPr>
+        <w:t>i</w:t>
+      </w:r>
+      <w:r>
+        <w:rPr>
+          <w:rFonts w:ascii="宋体" w:hAnsi="宋体" w:eastAsia="宋体" w:cs="宋体"/>
+          <w:sz w:val="24"/>
+          <w:szCs w:val="24"/>
+          <w:color w:val="000000"/>
+          <w:b w:val="0"/>
+          <w:i w:val="0"/>
         </w:rPr>
         <w:t>，且只有在</w:t>
       </w:r>
@@ -2609,7 +3027,7 @@
           <w:b w:val="0"/>
           <w:i w:val="0"/>
         </w:rPr>
-        <w:t>A_i&gt;E_i</w:t>
+        <w:t>A</w:t>
       </w:r>
       <w:r>
         <w:rPr>
@@ -2619,6 +3037,52 @@
           <w:color w:val="000000"/>
           <w:b w:val="0"/>
           <w:i w:val="0"/>
+          <w:vertAlign w:val="subscript"/>
+        </w:rPr>
+        <w:t>i</w:t>
+      </w:r>
+      <w:r>
+        <w:rPr>
+          <w:rFonts w:ascii="宋体" w:hAnsi="宋体" w:eastAsia="宋体" w:cs="宋体"/>
+          <w:sz w:val="24"/>
+          <w:szCs w:val="24"/>
+          <w:color w:val="000000"/>
+          <w:b w:val="0"/>
+          <w:i w:val="0"/>
+        </w:rPr>
+        <w:t>&gt;</w:t>
+      </w:r>
+      <w:r>
+        <w:rPr>
+          <w:rFonts w:ascii="宋体" w:hAnsi="宋体" w:eastAsia="宋体" w:cs="宋体"/>
+          <w:sz w:val="24"/>
+          <w:szCs w:val="24"/>
+          <w:color w:val="000000"/>
+          <w:b w:val="0"/>
+          <w:i w:val="0"/>
+        </w:rPr>
+        <w:t>E</w:t>
+      </w:r>
+      <w:r>
+        <w:rPr>
+          <w:rFonts w:ascii="宋体" w:hAnsi="宋体" w:eastAsia="宋体" w:cs="宋体"/>
+          <w:sz w:val="24"/>
+          <w:szCs w:val="24"/>
+          <w:color w:val="000000"/>
+          <w:b w:val="0"/>
+          <w:i w:val="0"/>
+          <w:vertAlign w:val="subscript"/>
+        </w:rPr>
+        <w:t>i</w:t>
+      </w:r>
+      <w:r>
+        <w:rPr>
+          <w:rFonts w:ascii="宋体" w:hAnsi="宋体" w:eastAsia="宋体" w:cs="宋体"/>
+          <w:sz w:val="24"/>
+          <w:szCs w:val="24"/>
+          <w:color w:val="000000"/>
+          <w:b w:val="0"/>
+          <w:i w:val="0"/>
         </w:rPr>
         <w:t>时记录行数下界</w:t>
       </w:r>
@@ -2631,7 +3095,7 @@
           <w:b w:val="0"/>
           <w:i w:val="0"/>
         </w:rPr>
-        <w:t>LOWER_BOUND(A_i)</w:t>
+        <w:t>LOWER_BOUND(</w:t>
       </w:r>
       <w:r>
         <w:rPr>
@@ -2642,6 +3106,40 @@
           <w:b w:val="0"/>
           <w:i w:val="0"/>
         </w:rPr>
+        <w:t>A</w:t>
+      </w:r>
+      <w:r>
+        <w:rPr>
+          <w:rFonts w:ascii="宋体" w:hAnsi="宋体" w:eastAsia="宋体" w:cs="宋体"/>
+          <w:sz w:val="24"/>
+          <w:szCs w:val="24"/>
+          <w:color w:val="000000"/>
+          <w:b w:val="0"/>
+          <w:i w:val="0"/>
+          <w:vertAlign w:val="subscript"/>
+        </w:rPr>
+        <w:t>i</w:t>
+      </w:r>
+      <w:r>
+        <w:rPr>
+          <w:rFonts w:ascii="宋体" w:hAnsi="宋体" w:eastAsia="宋体" w:cs="宋体"/>
+          <w:sz w:val="24"/>
+          <w:szCs w:val="24"/>
+          <w:color w:val="000000"/>
+          <w:b w:val="0"/>
+          <w:i w:val="0"/>
+        </w:rPr>
+        <w:t>)</w:t>
+      </w:r>
+      <w:r>
+        <w:rPr>
+          <w:rFonts w:ascii="宋体" w:hAnsi="宋体" w:eastAsia="宋体" w:cs="宋体"/>
+          <w:sz w:val="24"/>
+          <w:szCs w:val="24"/>
+          <w:color w:val="000000"/>
+          <w:b w:val="0"/>
+          <w:i w:val="0"/>
+        </w:rPr>
         <w:t>。节点未执行、统计无法比较，或者未确认结束且</w:t>
       </w:r>
       <w:r>
@@ -2653,7 +3151,53 @@
           <w:b w:val="0"/>
           <w:i w:val="0"/>
         </w:rPr>
-        <w:t>A_i≤E_i</w:t>
+        <w:t>A</w:t>
+      </w:r>
+      <w:r>
+        <w:rPr>
+          <w:rFonts w:ascii="宋体" w:hAnsi="宋体" w:eastAsia="宋体" w:cs="宋体"/>
+          <w:sz w:val="24"/>
+          <w:szCs w:val="24"/>
+          <w:color w:val="000000"/>
+          <w:b w:val="0"/>
+          <w:i w:val="0"/>
+          <w:vertAlign w:val="subscript"/>
+        </w:rPr>
+        <w:t>i</w:t>
+      </w:r>
+      <w:r>
+        <w:rPr>
+          <w:rFonts w:ascii="宋体" w:hAnsi="宋体" w:eastAsia="宋体" w:cs="宋体"/>
+          <w:sz w:val="24"/>
+          <w:szCs w:val="24"/>
+          <w:color w:val="000000"/>
+          <w:b w:val="0"/>
+          <w:i w:val="0"/>
+        </w:rPr>
+        <w:t>≤</w:t>
+      </w:r>
+      <w:r>
+        <w:rPr>
+          <w:rFonts w:ascii="宋体" w:hAnsi="宋体" w:eastAsia="宋体" w:cs="宋体"/>
+          <w:sz w:val="24"/>
+          <w:szCs w:val="24"/>
+          <w:color w:val="000000"/>
+          <w:b w:val="0"/>
+          <w:i w:val="0"/>
+        </w:rPr>
+        <w:t>E</w:t>
+      </w:r>
+      <w:r>
+        <w:rPr>
+          <w:rFonts w:ascii="宋体" w:hAnsi="宋体" w:eastAsia="宋体" w:cs="宋体"/>
+          <w:sz w:val="24"/>
+          <w:szCs w:val="24"/>
+          <w:color w:val="000000"/>
+          <w:b w:val="0"/>
+          <w:i w:val="0"/>
+          <w:vertAlign w:val="subscript"/>
+        </w:rPr>
+        <w:t>i</w:t>
       </w:r>
       <w:r>
         <w:rPr>

</xml_diff>